<commit_message>
feat(hospitais): auto-fill card Técnicas de Enfermagem em FDS e feriados
- Novo src/data/hospitaisTecnicas2026.js (21 dias abr+mai) com HRO, UNIMED e Plantão Pago
- Rollover às 07h + helpers (getHospitaisEfetivo, getHospitaisParaData, isDiaAutomaticoHospitais)
- HomePage e EscalasFuncionariasHubPage: em FDS/feriado, substitui HRO/UNIMED e adiciona PLANTÃO PAGO com a escala do docx. Dias úteis mantêm dados do Firestore.
- MATERNO/Férias/Atestado continuam vindo do Firestore em todos os dias.
- 13 testes novos — todos verdes.
</commit_message>
<xml_diff>
--- a/Colaboradores/Hospitais 2026.04.docx
+++ b/Colaboradores/Hospitais 2026.04.docx
@@ -1,6 +1,6 @@
 
 <file path=word/document.xml><?xml version="1.0" encoding="utf-8"?>
-<w:document xmlns:wpc="http://schemas.microsoft.com/office/word/2010/wordprocessingCanvas" xmlns:cx="http://schemas.microsoft.com/office/drawing/2014/chartex" xmlns:cx1="http://schemas.microsoft.com/office/drawing/2015/9/8/chartex" xmlns:cx2="http://schemas.microsoft.com/office/drawing/2015/10/21/chartex" xmlns:cx3="http://schemas.microsoft.com/office/drawing/2016/5/9/chartex" xmlns:cx4="http://schemas.microsoft.com/office/drawing/2016/5/10/chartex" xmlns:cx5="http://schemas.microsoft.com/office/drawing/2016/5/11/chartex" xmlns:cx6="http://schemas.microsoft.com/office/drawing/2016/5/12/chartex" xmlns:cx7="http://schemas.microsoft.com/office/drawing/2016/5/13/chartex" xmlns:cx8="http://schemas.microsoft.com/office/drawing/2016/5/14/chartex" xmlns:mc="http://schemas.openxmlformats.org/markup-compatibility/2006" xmlns:aink="http://schemas.microsoft.com/office/drawing/2016/ink" xmlns:am3d="http://schemas.microsoft.com/office/drawing/2017/model3d" xmlns:o="urn:schemas-microsoft-com:office:office" xmlns:oel="http://schemas.microsoft.com/office/2019/extlst" xmlns:r="http://schemas.openxmlformats.org/officeDocument/2006/relationships" xmlns:m="http://schemas.openxmlformats.org/officeDocument/2006/math" xmlns:v="urn:schemas-microsoft-com:vml" xmlns:wp14="http://schemas.microsoft.com/office/word/2010/wordprocessingDrawing" xmlns:wp="http://schemas.openxmlformats.org/drawingml/2006/wordprocessingDrawing" xmlns:w10="urn:schemas-microsoft-com:office:word" xmlns:w="http://schemas.openxmlformats.org/wordprocessingml/2006/main" xmlns:w14="http://schemas.microsoft.com/office/word/2010/wordml" xmlns:w15="http://schemas.microsoft.com/office/word/2012/wordml" xmlns:w16cex="http://schemas.microsoft.com/office/word/2018/wordml/cex" xmlns:w16cid="http://schemas.microsoft.com/office/word/2016/wordml/cid" xmlns:w16="http://schemas.microsoft.com/office/word/2018/wordml" xmlns:w16sdtdh="http://schemas.microsoft.com/office/word/2020/wordml/sdtdatahash" xmlns:w16se="http://schemas.microsoft.com/office/word/2015/wordml/symex" xmlns:wpg="http://schemas.microsoft.com/office/word/2010/wordprocessingGroup" xmlns:wpi="http://schemas.microsoft.com/office/word/2010/wordprocessingInk" xmlns:wne="http://schemas.microsoft.com/office/word/2006/wordml" xmlns:wps="http://schemas.microsoft.com/office/word/2010/wordprocessingShape" mc:Ignorable="w14 w15 w16se w16cid w16 w16cex w16sdtdh wp14">
+<w:document xmlns:wpc="http://schemas.microsoft.com/office/word/2010/wordprocessingCanvas" xmlns:cx="http://schemas.microsoft.com/office/drawing/2014/chartex" xmlns:cx1="http://schemas.microsoft.com/office/drawing/2015/9/8/chartex" xmlns:cx2="http://schemas.microsoft.com/office/drawing/2015/10/21/chartex" xmlns:cx3="http://schemas.microsoft.com/office/drawing/2016/5/9/chartex" xmlns:cx4="http://schemas.microsoft.com/office/drawing/2016/5/10/chartex" xmlns:cx5="http://schemas.microsoft.com/office/drawing/2016/5/11/chartex" xmlns:cx6="http://schemas.microsoft.com/office/drawing/2016/5/12/chartex" xmlns:cx7="http://schemas.microsoft.com/office/drawing/2016/5/13/chartex" xmlns:cx8="http://schemas.microsoft.com/office/drawing/2016/5/14/chartex" xmlns:mc="http://schemas.openxmlformats.org/markup-compatibility/2006" xmlns:aink="http://schemas.microsoft.com/office/drawing/2016/ink" xmlns:am3d="http://schemas.microsoft.com/office/drawing/2017/model3d" xmlns:o="urn:schemas-microsoft-com:office:office" xmlns:oel="http://schemas.microsoft.com/office/2019/extlst" xmlns:r="http://schemas.openxmlformats.org/officeDocument/2006/relationships" xmlns:m="http://schemas.openxmlformats.org/officeDocument/2006/math" xmlns:v="urn:schemas-microsoft-com:vml" xmlns:wp14="http://schemas.microsoft.com/office/word/2010/wordprocessingDrawing" xmlns:wp="http://schemas.openxmlformats.org/drawingml/2006/wordprocessingDrawing" xmlns:w10="urn:schemas-microsoft-com:office:word" xmlns:w="http://schemas.openxmlformats.org/wordprocessingml/2006/main" xmlns:w14="http://schemas.microsoft.com/office/word/2010/wordml" xmlns:w15="http://schemas.microsoft.com/office/word/2012/wordml" xmlns:w16cex="http://schemas.microsoft.com/office/word/2018/wordml/cex" xmlns:w16cid="http://schemas.microsoft.com/office/word/2016/wordml/cid" xmlns:w16="http://schemas.microsoft.com/office/word/2018/wordml" xmlns:w16du="http://schemas.microsoft.com/office/word/2023/wordml/word16du" xmlns:w16sdtdh="http://schemas.microsoft.com/office/word/2020/wordml/sdtdatahash" xmlns:w16sdtfl="http://schemas.microsoft.com/office/word/2024/wordml/sdtformatlock" xmlns:w16se="http://schemas.microsoft.com/office/word/2015/wordml/symex" xmlns:wpg="http://schemas.microsoft.com/office/word/2010/wordprocessingGroup" xmlns:wpi="http://schemas.microsoft.com/office/word/2010/wordprocessingInk" xmlns:wne="http://schemas.microsoft.com/office/word/2006/wordml" xmlns:wps="http://schemas.microsoft.com/office/word/2010/wordprocessingShape" mc:Ignorable="w14 w15 w16se w16cid w16 w16cex w16sdtdh w16sdtfl w16du wp14">
   <w:body>
     <w:tbl>
       <w:tblPr>
@@ -11,8 +11,8 @@
       </w:tblPr>
       <w:tblGrid>
         <w:gridCol w:w="1592"/>
-        <w:gridCol w:w="2971"/>
-        <w:gridCol w:w="2840"/>
+        <w:gridCol w:w="2972"/>
+        <w:gridCol w:w="2839"/>
         <w:gridCol w:w="2946"/>
       </w:tblGrid>
       <w:tr>
@@ -270,123 +270,96 @@
                 <w:sz w:val="24"/>
                 <w:szCs w:val="24"/>
               </w:rPr>
-              <w:t xml:space="preserve">(07 AS 15) </w:t>
-            </w:r>
-            <w:r>
+              <w:t xml:space="preserve">(07 AS 15) RENATA </w:t>
+            </w:r>
+          </w:p>
+          <w:p>
+            <w:pPr>
               <w:rPr>
                 <w:b/>
                 <w:color w:val="FF0066"/>
                 <w:sz w:val="24"/>
                 <w:szCs w:val="24"/>
               </w:rPr>
-              <w:t xml:space="preserve">RENATA </w:t>
-            </w:r>
-          </w:p>
-          <w:p>
-            <w:pPr>
+            </w:pPr>
+            <w:r>
               <w:rPr>
                 <w:b/>
                 <w:color w:val="FF0066"/>
                 <w:sz w:val="24"/>
                 <w:szCs w:val="24"/>
               </w:rPr>
-            </w:pPr>
-            <w:r>
+              <w:t>FUNC.UNIMED</w:t>
+            </w:r>
+          </w:p>
+        </w:tc>
+        <w:tc>
+          <w:tcPr>
+            <w:tcW w:w="2851" w:type="dxa"/>
+            <w:tcBorders>
+              <w:top w:val="single" w:sz="4" w:space="0" w:color="auto"/>
+              <w:left w:val="single" w:sz="4" w:space="0" w:color="auto"/>
+              <w:bottom w:val="single" w:sz="4" w:space="0" w:color="auto"/>
+              <w:right w:val="single" w:sz="4" w:space="0" w:color="auto"/>
+            </w:tcBorders>
+          </w:tcPr>
+          <w:p>
+            <w:pPr>
               <w:rPr>
                 <w:b/>
                 <w:color w:val="FF0066"/>
                 <w:sz w:val="24"/>
                 <w:szCs w:val="24"/>
               </w:rPr>
-              <w:t>FUNC.UNIMED</w:t>
-            </w:r>
-          </w:p>
-        </w:tc>
-        <w:tc>
-          <w:tcPr>
-            <w:tcW w:w="2851" w:type="dxa"/>
-            <w:tcBorders>
-              <w:top w:val="single" w:sz="4" w:space="0" w:color="auto"/>
-              <w:left w:val="single" w:sz="4" w:space="0" w:color="auto"/>
-              <w:bottom w:val="single" w:sz="4" w:space="0" w:color="auto"/>
-              <w:right w:val="single" w:sz="4" w:space="0" w:color="auto"/>
-            </w:tcBorders>
-          </w:tcPr>
-          <w:p>
-            <w:pPr>
+            </w:pPr>
+            <w:r>
               <w:rPr>
                 <w:b/>
                 <w:color w:val="FF0066"/>
                 <w:sz w:val="24"/>
                 <w:szCs w:val="24"/>
               </w:rPr>
-            </w:pPr>
-            <w:r>
+              <w:t xml:space="preserve">(07 AS 15) LUCIANA </w:t>
+            </w:r>
+          </w:p>
+          <w:p>
+            <w:pPr>
               <w:rPr>
                 <w:b/>
                 <w:color w:val="FF0066"/>
                 <w:sz w:val="24"/>
                 <w:szCs w:val="24"/>
               </w:rPr>
-              <w:t xml:space="preserve">(07 AS 15) </w:t>
-            </w:r>
-            <w:r>
+            </w:pPr>
+          </w:p>
+        </w:tc>
+        <w:tc>
+          <w:tcPr>
+            <w:tcW w:w="2958" w:type="dxa"/>
+            <w:tcBorders>
+              <w:top w:val="single" w:sz="4" w:space="0" w:color="auto"/>
+              <w:left w:val="single" w:sz="4" w:space="0" w:color="auto"/>
+              <w:bottom w:val="single" w:sz="4" w:space="0" w:color="auto"/>
+              <w:right w:val="single" w:sz="4" w:space="0" w:color="auto"/>
+            </w:tcBorders>
+          </w:tcPr>
+          <w:p>
+            <w:pPr>
               <w:rPr>
                 <w:b/>
                 <w:color w:val="FF0066"/>
                 <w:sz w:val="24"/>
                 <w:szCs w:val="24"/>
               </w:rPr>
-              <w:t xml:space="preserve">LUCIANA </w:t>
-            </w:r>
-          </w:p>
-          <w:p>
-            <w:pPr>
+            </w:pPr>
+            <w:r>
               <w:rPr>
                 <w:b/>
                 <w:color w:val="FF0066"/>
                 <w:sz w:val="24"/>
                 <w:szCs w:val="24"/>
               </w:rPr>
-            </w:pPr>
-          </w:p>
-        </w:tc>
-        <w:tc>
-          <w:tcPr>
-            <w:tcW w:w="2958" w:type="dxa"/>
-            <w:tcBorders>
-              <w:top w:val="single" w:sz="4" w:space="0" w:color="auto"/>
-              <w:left w:val="single" w:sz="4" w:space="0" w:color="auto"/>
-              <w:bottom w:val="single" w:sz="4" w:space="0" w:color="auto"/>
-              <w:right w:val="single" w:sz="4" w:space="0" w:color="auto"/>
-            </w:tcBorders>
-          </w:tcPr>
-          <w:p>
-            <w:pPr>
-              <w:rPr>
-                <w:b/>
-                <w:color w:val="FF0066"/>
-                <w:sz w:val="24"/>
-                <w:szCs w:val="24"/>
-              </w:rPr>
-            </w:pPr>
-            <w:r>
-              <w:rPr>
-                <w:b/>
-                <w:color w:val="FF0066"/>
-                <w:sz w:val="24"/>
-                <w:szCs w:val="24"/>
-              </w:rPr>
-              <w:t>(</w:t>
-            </w:r>
-            <w:r>
-              <w:rPr>
-                <w:b/>
-                <w:color w:val="FF0066"/>
-                <w:sz w:val="24"/>
-                <w:szCs w:val="24"/>
-              </w:rPr>
-              <w:t xml:space="preserve">15 AS  23) MARI </w:t>
+              <w:t xml:space="preserve">(15 AS  23) MARI </w:t>
             </w:r>
           </w:p>
           <w:p>
@@ -1659,141 +1632,96 @@
                 <w:sz w:val="24"/>
                 <w:szCs w:val="24"/>
               </w:rPr>
-              <w:t xml:space="preserve">(07 AS 15) </w:t>
-            </w:r>
-            <w:r>
+              <w:t xml:space="preserve">(07 AS 15) SAIONARA </w:t>
+            </w:r>
+          </w:p>
+          <w:p>
+            <w:pPr>
               <w:rPr>
                 <w:b/>
                 <w:color w:val="FF0066"/>
                 <w:sz w:val="24"/>
                 <w:szCs w:val="24"/>
               </w:rPr>
-              <w:t xml:space="preserve">SAIONARA </w:t>
-            </w:r>
-          </w:p>
-          <w:p>
-            <w:pPr>
+            </w:pPr>
+            <w:r>
               <w:rPr>
                 <w:b/>
                 <w:color w:val="FF0066"/>
                 <w:sz w:val="24"/>
                 <w:szCs w:val="24"/>
               </w:rPr>
-            </w:pPr>
-            <w:r>
+              <w:t>FUNC.UNIMED</w:t>
+            </w:r>
+          </w:p>
+        </w:tc>
+        <w:tc>
+          <w:tcPr>
+            <w:tcW w:w="2851" w:type="dxa"/>
+            <w:tcBorders>
+              <w:top w:val="single" w:sz="4" w:space="0" w:color="auto"/>
+              <w:left w:val="single" w:sz="4" w:space="0" w:color="auto"/>
+              <w:bottom w:val="single" w:sz="4" w:space="0" w:color="auto"/>
+              <w:right w:val="single" w:sz="4" w:space="0" w:color="auto"/>
+            </w:tcBorders>
+          </w:tcPr>
+          <w:p>
+            <w:pPr>
               <w:rPr>
                 <w:b/>
                 <w:color w:val="FF0066"/>
                 <w:sz w:val="24"/>
                 <w:szCs w:val="24"/>
               </w:rPr>
-              <w:t>FUNC.UNIMED</w:t>
-            </w:r>
-          </w:p>
-        </w:tc>
-        <w:tc>
-          <w:tcPr>
-            <w:tcW w:w="2851" w:type="dxa"/>
-            <w:tcBorders>
-              <w:top w:val="single" w:sz="4" w:space="0" w:color="auto"/>
-              <w:left w:val="single" w:sz="4" w:space="0" w:color="auto"/>
-              <w:bottom w:val="single" w:sz="4" w:space="0" w:color="auto"/>
-              <w:right w:val="single" w:sz="4" w:space="0" w:color="auto"/>
-            </w:tcBorders>
-          </w:tcPr>
-          <w:p>
-            <w:pPr>
+            </w:pPr>
+            <w:r>
               <w:rPr>
                 <w:b/>
                 <w:color w:val="FF0066"/>
                 <w:sz w:val="24"/>
                 <w:szCs w:val="24"/>
               </w:rPr>
-            </w:pPr>
-            <w:r>
+              <w:t xml:space="preserve">(07 AS 15) ELISETE </w:t>
+            </w:r>
+          </w:p>
+          <w:p>
+            <w:pPr>
               <w:rPr>
                 <w:b/>
                 <w:color w:val="FF0066"/>
                 <w:sz w:val="24"/>
                 <w:szCs w:val="24"/>
               </w:rPr>
-              <w:t xml:space="preserve">(07 AS 15) </w:t>
-            </w:r>
-            <w:r>
+            </w:pPr>
+          </w:p>
+        </w:tc>
+        <w:tc>
+          <w:tcPr>
+            <w:tcW w:w="2958" w:type="dxa"/>
+            <w:tcBorders>
+              <w:top w:val="single" w:sz="4" w:space="0" w:color="auto"/>
+              <w:left w:val="single" w:sz="4" w:space="0" w:color="auto"/>
+              <w:bottom w:val="single" w:sz="4" w:space="0" w:color="auto"/>
+              <w:right w:val="single" w:sz="4" w:space="0" w:color="auto"/>
+            </w:tcBorders>
+          </w:tcPr>
+          <w:p>
+            <w:pPr>
               <w:rPr>
                 <w:b/>
                 <w:color w:val="FF0066"/>
                 <w:sz w:val="24"/>
                 <w:szCs w:val="24"/>
               </w:rPr>
-              <w:t xml:space="preserve">ELISETE </w:t>
-            </w:r>
-          </w:p>
-          <w:p>
-            <w:pPr>
+            </w:pPr>
+            <w:r>
               <w:rPr>
                 <w:b/>
                 <w:color w:val="FF0066"/>
                 <w:sz w:val="24"/>
                 <w:szCs w:val="24"/>
               </w:rPr>
-            </w:pPr>
-          </w:p>
-        </w:tc>
-        <w:tc>
-          <w:tcPr>
-            <w:tcW w:w="2958" w:type="dxa"/>
-            <w:tcBorders>
-              <w:top w:val="single" w:sz="4" w:space="0" w:color="auto"/>
-              <w:left w:val="single" w:sz="4" w:space="0" w:color="auto"/>
-              <w:bottom w:val="single" w:sz="4" w:space="0" w:color="auto"/>
-              <w:right w:val="single" w:sz="4" w:space="0" w:color="auto"/>
-            </w:tcBorders>
-          </w:tcPr>
-          <w:p>
-            <w:pPr>
-              <w:rPr>
-                <w:b/>
-                <w:color w:val="FF0066"/>
-                <w:sz w:val="24"/>
-                <w:szCs w:val="24"/>
-              </w:rPr>
-            </w:pPr>
-            <w:r>
-              <w:rPr>
-                <w:b/>
-                <w:color w:val="FF0066"/>
-                <w:sz w:val="24"/>
-                <w:szCs w:val="24"/>
-              </w:rPr>
-              <w:t>(</w:t>
-            </w:r>
-            <w:r>
-              <w:rPr>
-                <w:b/>
-                <w:color w:val="FF0066"/>
-                <w:sz w:val="24"/>
-                <w:szCs w:val="24"/>
-              </w:rPr>
-              <w:t>15 AS 23</w:t>
-            </w:r>
-            <w:r>
-              <w:rPr>
-                <w:b/>
-                <w:color w:val="FF0066"/>
-                <w:sz w:val="24"/>
-                <w:szCs w:val="24"/>
-              </w:rPr>
-              <w:t xml:space="preserve">) </w:t>
-            </w:r>
-            <w:r>
-              <w:rPr>
-                <w:b/>
-                <w:color w:val="FF0066"/>
-                <w:sz w:val="24"/>
-                <w:szCs w:val="24"/>
-              </w:rPr>
-              <w:t xml:space="preserve">LUCIANA </w:t>
+              <w:t xml:space="preserve">(15 AS 23) LUCIANA </w:t>
             </w:r>
           </w:p>
           <w:p>
@@ -2297,283 +2225,27 @@
                 <w:szCs w:val="24"/>
               </w:rPr>
             </w:pPr>
-            <w:r>
+          </w:p>
+        </w:tc>
+        <w:tc>
+          <w:tcPr>
+            <w:tcW w:w="2958" w:type="dxa"/>
+            <w:tcBorders>
+              <w:top w:val="single" w:sz="4" w:space="0" w:color="auto"/>
+              <w:left w:val="single" w:sz="4" w:space="0" w:color="auto"/>
+              <w:bottom w:val="single" w:sz="4" w:space="0" w:color="auto"/>
+              <w:right w:val="single" w:sz="4" w:space="0" w:color="auto"/>
+            </w:tcBorders>
+          </w:tcPr>
+          <w:p>
+            <w:pPr>
               <w:rPr>
                 <w:b/>
                 <w:color w:val="9966FF"/>
                 <w:sz w:val="24"/>
                 <w:szCs w:val="24"/>
               </w:rPr>
-              <w:t>SAIONARA</w:t>
-            </w:r>
-            <w:r>
-              <w:rPr>
-                <w:b/>
-                <w:color w:val="9966FF"/>
-                <w:sz w:val="24"/>
-                <w:szCs w:val="24"/>
-              </w:rPr>
-              <w:t xml:space="preserve"> 0</w:t>
-            </w:r>
-            <w:r>
-              <w:rPr>
-                <w:b/>
-                <w:color w:val="9966FF"/>
-                <w:sz w:val="24"/>
-                <w:szCs w:val="24"/>
-              </w:rPr>
-              <w:t xml:space="preserve">5 </w:t>
-            </w:r>
-            <w:r>
-              <w:rPr>
-                <w:b/>
-                <w:color w:val="9966FF"/>
-                <w:sz w:val="24"/>
-                <w:szCs w:val="24"/>
-              </w:rPr>
-              <w:t xml:space="preserve">PLANTÃO </w:t>
-            </w:r>
-          </w:p>
-          <w:p>
-            <w:pPr>
-              <w:rPr>
-                <w:b/>
-                <w:color w:val="9966FF"/>
-                <w:sz w:val="24"/>
-                <w:szCs w:val="24"/>
-              </w:rPr>
-            </w:pPr>
-            <w:r>
-              <w:rPr>
-                <w:b/>
-                <w:color w:val="9966FF"/>
-                <w:sz w:val="24"/>
-                <w:szCs w:val="24"/>
-              </w:rPr>
-              <w:t xml:space="preserve">LUCIANA </w:t>
-            </w:r>
-            <w:r>
-              <w:rPr>
-                <w:b/>
-                <w:color w:val="9966FF"/>
-                <w:sz w:val="24"/>
-                <w:szCs w:val="24"/>
-              </w:rPr>
-              <w:t>0</w:t>
-            </w:r>
-            <w:r>
-              <w:rPr>
-                <w:b/>
-                <w:color w:val="9966FF"/>
-                <w:sz w:val="24"/>
-                <w:szCs w:val="24"/>
-              </w:rPr>
-              <w:t>5</w:t>
-            </w:r>
-            <w:r>
-              <w:rPr>
-                <w:b/>
-                <w:color w:val="9966FF"/>
-                <w:sz w:val="24"/>
-                <w:szCs w:val="24"/>
-              </w:rPr>
-              <w:t xml:space="preserve"> </w:t>
-            </w:r>
-            <w:r>
-              <w:rPr>
-                <w:b/>
-                <w:color w:val="9966FF"/>
-                <w:sz w:val="24"/>
-                <w:szCs w:val="24"/>
-              </w:rPr>
-              <w:t xml:space="preserve">PLANTÃO </w:t>
-            </w:r>
-          </w:p>
-          <w:p>
-            <w:pPr>
-              <w:rPr>
-                <w:b/>
-                <w:color w:val="9966FF"/>
-                <w:sz w:val="24"/>
-                <w:szCs w:val="24"/>
-              </w:rPr>
-            </w:pPr>
-            <w:r>
-              <w:rPr>
-                <w:b/>
-                <w:color w:val="9966FF"/>
-                <w:sz w:val="24"/>
-                <w:szCs w:val="24"/>
-              </w:rPr>
-              <w:t xml:space="preserve">ELISETE  </w:t>
-            </w:r>
-            <w:r>
-              <w:rPr>
-                <w:b/>
-                <w:color w:val="9966FF"/>
-                <w:sz w:val="24"/>
-                <w:szCs w:val="24"/>
-              </w:rPr>
-              <w:t>0</w:t>
-            </w:r>
-            <w:r>
-              <w:rPr>
-                <w:b/>
-                <w:color w:val="9966FF"/>
-                <w:sz w:val="24"/>
-                <w:szCs w:val="24"/>
-              </w:rPr>
-              <w:t>4</w:t>
-            </w:r>
-            <w:r>
-              <w:rPr>
-                <w:b/>
-                <w:color w:val="9966FF"/>
-                <w:sz w:val="24"/>
-                <w:szCs w:val="24"/>
-              </w:rPr>
-              <w:t xml:space="preserve"> </w:t>
-            </w:r>
-            <w:r>
-              <w:rPr>
-                <w:b/>
-                <w:color w:val="9966FF"/>
-                <w:sz w:val="24"/>
-                <w:szCs w:val="24"/>
-              </w:rPr>
-              <w:t xml:space="preserve">PLANTÃO </w:t>
-            </w:r>
-          </w:p>
-        </w:tc>
-        <w:tc>
-          <w:tcPr>
-            <w:tcW w:w="2958" w:type="dxa"/>
-            <w:tcBorders>
-              <w:top w:val="single" w:sz="4" w:space="0" w:color="auto"/>
-              <w:left w:val="single" w:sz="4" w:space="0" w:color="auto"/>
-              <w:bottom w:val="single" w:sz="4" w:space="0" w:color="auto"/>
-              <w:right w:val="single" w:sz="4" w:space="0" w:color="auto"/>
-            </w:tcBorders>
-          </w:tcPr>
-          <w:p>
-            <w:pPr>
-              <w:rPr>
-                <w:b/>
-                <w:color w:val="9966FF"/>
-                <w:sz w:val="24"/>
-                <w:szCs w:val="24"/>
-              </w:rPr>
-            </w:pPr>
-            <w:r>
-              <w:rPr>
-                <w:b/>
-                <w:color w:val="9966FF"/>
-                <w:sz w:val="24"/>
-                <w:szCs w:val="24"/>
-              </w:rPr>
-              <w:t>RENATA</w:t>
-            </w:r>
-            <w:r>
-              <w:rPr>
-                <w:b/>
-                <w:color w:val="9966FF"/>
-                <w:sz w:val="24"/>
-                <w:szCs w:val="24"/>
-              </w:rPr>
-              <w:t xml:space="preserve"> 0</w:t>
-            </w:r>
-            <w:r>
-              <w:rPr>
-                <w:b/>
-                <w:color w:val="9966FF"/>
-                <w:sz w:val="24"/>
-                <w:szCs w:val="24"/>
-              </w:rPr>
-              <w:t xml:space="preserve">5 </w:t>
-            </w:r>
-            <w:r>
-              <w:rPr>
-                <w:b/>
-                <w:color w:val="9966FF"/>
-                <w:sz w:val="24"/>
-                <w:szCs w:val="24"/>
-              </w:rPr>
-              <w:t xml:space="preserve">PLANTÃO </w:t>
-            </w:r>
-          </w:p>
-          <w:p>
-            <w:pPr>
-              <w:rPr>
-                <w:b/>
-                <w:color w:val="9966FF"/>
-                <w:sz w:val="24"/>
-                <w:szCs w:val="24"/>
-              </w:rPr>
-            </w:pPr>
-            <w:r>
-              <w:rPr>
-                <w:b/>
-                <w:color w:val="9966FF"/>
-                <w:sz w:val="24"/>
-                <w:szCs w:val="24"/>
-              </w:rPr>
-              <w:t xml:space="preserve">MARTA </w:t>
-            </w:r>
-            <w:r>
-              <w:rPr>
-                <w:b/>
-                <w:color w:val="9966FF"/>
-                <w:sz w:val="24"/>
-                <w:szCs w:val="24"/>
-              </w:rPr>
-              <w:t xml:space="preserve">02 </w:t>
-            </w:r>
-            <w:r>
-              <w:rPr>
-                <w:b/>
-                <w:color w:val="9966FF"/>
-                <w:sz w:val="24"/>
-                <w:szCs w:val="24"/>
-              </w:rPr>
-              <w:t xml:space="preserve">PLANTÃO </w:t>
-            </w:r>
-          </w:p>
-          <w:p>
-            <w:pPr>
-              <w:rPr>
-                <w:b/>
-                <w:color w:val="9966FF"/>
-                <w:sz w:val="24"/>
-                <w:szCs w:val="24"/>
-              </w:rPr>
-            </w:pPr>
-            <w:r>
-              <w:rPr>
-                <w:b/>
-                <w:color w:val="9966FF"/>
-                <w:sz w:val="24"/>
-                <w:szCs w:val="24"/>
-              </w:rPr>
-              <w:t>MARITANIA</w:t>
-            </w:r>
-            <w:r>
-              <w:rPr>
-                <w:b/>
-                <w:color w:val="9966FF"/>
-                <w:sz w:val="24"/>
-                <w:szCs w:val="24"/>
-              </w:rPr>
-              <w:t xml:space="preserve"> 05 </w:t>
-            </w:r>
-            <w:r>
-              <w:rPr>
-                <w:b/>
-                <w:color w:val="9966FF"/>
-                <w:sz w:val="24"/>
-                <w:szCs w:val="24"/>
-              </w:rPr>
-              <w:t xml:space="preserve">PLANTÃO </w:t>
-            </w:r>
+            </w:pPr>
           </w:p>
         </w:tc>
       </w:tr>
@@ -2607,7 +2279,7 @@
 </file>
 
 <file path=word/styles.xml><?xml version="1.0" encoding="utf-8"?>
-<w:styles xmlns:mc="http://schemas.openxmlformats.org/markup-compatibility/2006" xmlns:r="http://schemas.openxmlformats.org/officeDocument/2006/relationships" xmlns:w="http://schemas.openxmlformats.org/wordprocessingml/2006/main" xmlns:w14="http://schemas.microsoft.com/office/word/2010/wordml" xmlns:w15="http://schemas.microsoft.com/office/word/2012/wordml" xmlns:w16cex="http://schemas.microsoft.com/office/word/2018/wordml/cex" xmlns:w16cid="http://schemas.microsoft.com/office/word/2016/wordml/cid" xmlns:w16="http://schemas.microsoft.com/office/word/2018/wordml" xmlns:w16sdtdh="http://schemas.microsoft.com/office/word/2020/wordml/sdtdatahash" xmlns:w16se="http://schemas.microsoft.com/office/word/2015/wordml/symex" mc:Ignorable="w14 w15 w16se w16cid w16 w16cex w16sdtdh">
+<w:styles xmlns:mc="http://schemas.openxmlformats.org/markup-compatibility/2006" xmlns:r="http://schemas.openxmlformats.org/officeDocument/2006/relationships" xmlns:w="http://schemas.openxmlformats.org/wordprocessingml/2006/main" xmlns:w14="http://schemas.microsoft.com/office/word/2010/wordml" xmlns:w15="http://schemas.microsoft.com/office/word/2012/wordml" xmlns:w16cex="http://schemas.microsoft.com/office/word/2018/wordml/cex" xmlns:w16cid="http://schemas.microsoft.com/office/word/2016/wordml/cid" xmlns:w16="http://schemas.microsoft.com/office/word/2018/wordml" xmlns:w16du="http://schemas.microsoft.com/office/word/2023/wordml/word16du" xmlns:w16sdtdh="http://schemas.microsoft.com/office/word/2020/wordml/sdtdatahash" xmlns:w16sdtfl="http://schemas.microsoft.com/office/word/2024/wordml/sdtformatlock" xmlns:w16se="http://schemas.microsoft.com/office/word/2015/wordml/symex" mc:Ignorable="w14 w15 w16se w16cid w16 w16cex w16sdtdh w16sdtfl w16du">
   <w:docDefaults>
     <w:rPrDefault>
       <w:rPr>

</xml_diff>